<commit_message>
Switch theme to light background
Change site color scheme from dark to light: update CSS :root variables (--surface -> #ffffff, --card -> #7a6a6a00) and adjust header background to a light translucent white. Also replace/update the accompanying .docx file (binary content changed).
</commit_message>
<xml_diff>
--- a/Новый текст дипломной работы.docx
+++ b/Новый текст дипломной работы.docx
@@ -10278,6 +10278,9 @@
         </w:tabs>
         <w:spacing w:line="360" w:lineRule="auto"/>
         <w:jc w:val="both"/>
+        <w:rPr>
+          <w:lang w:val="ru-RU"/>
+        </w:rPr>
       </w:pPr>
       <w:r>
         <w:rPr>
@@ -10305,6 +10308,7 @@
           <w:iCs/>
           <w:sz w:val="28"/>
           <w:szCs w:val="28"/>
+          <w:lang w:val="ru-RU"/>
         </w:rPr>
         <w:t>_</w:t>
       </w:r>
@@ -10325,6 +10329,7 @@
           <w:iCs/>
           <w:sz w:val="28"/>
           <w:szCs w:val="28"/>
+          <w:lang w:val="ru-RU"/>
         </w:rPr>
         <w:t>(</w:t>
       </w:r>
@@ -10345,6 +10350,7 @@
           <w:iCs/>
           <w:sz w:val="28"/>
           <w:szCs w:val="28"/>
+          <w:lang w:val="ru-RU"/>
         </w:rPr>
         <w:t xml:space="preserve">, </w:t>
       </w:r>
@@ -10365,6 +10371,7 @@
           <w:iCs/>
           <w:sz w:val="28"/>
           <w:szCs w:val="28"/>
+          <w:lang w:val="ru-RU"/>
         </w:rPr>
         <w:t>) = √((</w:t>
       </w:r>
@@ -10385,6 +10392,7 @@
           <w:iCs/>
           <w:sz w:val="28"/>
           <w:szCs w:val="28"/>
+          <w:lang w:val="ru-RU"/>
         </w:rPr>
         <w:t>_</w:t>
       </w:r>
@@ -10405,6 +10413,7 @@
           <w:iCs/>
           <w:sz w:val="28"/>
           <w:szCs w:val="28"/>
+          <w:lang w:val="ru-RU"/>
         </w:rPr>
         <w:t xml:space="preserve"> − </w:t>
       </w:r>
@@ -10425,6 +10434,7 @@
           <w:iCs/>
           <w:sz w:val="28"/>
           <w:szCs w:val="28"/>
+          <w:lang w:val="ru-RU"/>
         </w:rPr>
         <w:t>_</w:t>
       </w:r>
@@ -10445,6 +10455,7 @@
           <w:iCs/>
           <w:sz w:val="28"/>
           <w:szCs w:val="28"/>
+          <w:lang w:val="ru-RU"/>
         </w:rPr>
         <w:t>)² + (</w:t>
       </w:r>
@@ -10465,6 +10476,7 @@
           <w:iCs/>
           <w:sz w:val="28"/>
           <w:szCs w:val="28"/>
+          <w:lang w:val="ru-RU"/>
         </w:rPr>
         <w:t>_</w:t>
       </w:r>
@@ -10485,6 +10497,7 @@
           <w:iCs/>
           <w:sz w:val="28"/>
           <w:szCs w:val="28"/>
+          <w:lang w:val="ru-RU"/>
         </w:rPr>
         <w:t xml:space="preserve"> − </w:t>
       </w:r>
@@ -10505,6 +10518,7 @@
           <w:iCs/>
           <w:sz w:val="28"/>
           <w:szCs w:val="28"/>
+          <w:lang w:val="ru-RU"/>
         </w:rPr>
         <w:t>_</w:t>
       </w:r>
@@ -10525,6 +10539,7 @@
           <w:iCs/>
           <w:sz w:val="28"/>
           <w:szCs w:val="28"/>
+          <w:lang w:val="ru-RU"/>
         </w:rPr>
         <w:t>)²)</w:t>
       </w:r>
@@ -10533,12 +10548,19 @@
           <w:rFonts w:ascii="Times New Roman" w:eastAsia="Times New Roman" w:hAnsi="Times New Roman"/>
           <w:sz w:val="28"/>
           <w:szCs w:val="28"/>
+          <w:lang w:val="ru-RU"/>
         </w:rPr>
         <w:tab/>
         <w:t>(1.3.3)</w:t>
       </w:r>
     </w:p>
-    <w:p/>
+    <w:p>
+      <w:pPr>
+        <w:rPr>
+          <w:lang w:val="ru-RU"/>
+        </w:rPr>
+      </w:pPr>
+    </w:p>
     <w:p>
       <w:pPr>
         <w:spacing w:line="360" w:lineRule="auto"/>
@@ -16624,10 +16646,10 @@
           <w:noProof/>
         </w:rPr>
         <w:drawing>
-          <wp:inline distT="0" distB="0" distL="0" distR="0" wp14:anchorId="4D045A24" wp14:editId="01F0FDC1">
-            <wp:extent cx="5927718" cy="4381500"/>
-            <wp:effectExtent l="0" t="0" r="0" b="0"/>
-            <wp:docPr id="744183374" name="Рисунок 744183374"/>
+          <wp:inline distT="0" distB="0" distL="0" distR="0" wp14:anchorId="7CFCF140" wp14:editId="561AC3DF">
+            <wp:extent cx="5943600" cy="4391025"/>
+            <wp:effectExtent l="0" t="0" r="0" b="9525"/>
+            <wp:docPr id="1889502361" name="Рисунок 1"/>
             <wp:cNvGraphicFramePr>
               <a:graphicFrameLocks xmlns:a="http://schemas.openxmlformats.org/drawingml/2006/main" noChangeAspect="1"/>
             </wp:cNvGraphicFramePr>
@@ -16635,13 +16657,19 @@
               <a:graphicData uri="http://schemas.openxmlformats.org/drawingml/2006/picture">
                 <pic:pic xmlns:pic="http://schemas.openxmlformats.org/drawingml/2006/picture">
                   <pic:nvPicPr>
-                    <pic:cNvPr id="0" name=""/>
+                    <pic:cNvPr id="0" name="Picture 1"/>
                     <pic:cNvPicPr>
                       <a:picLocks noChangeAspect="1" noChangeArrowheads="1"/>
                     </pic:cNvPicPr>
                   </pic:nvPicPr>
                   <pic:blipFill>
-                    <a:blip r:embed="rId13"/>
+                    <a:blip r:embed="rId13">
+                      <a:extLst>
+                        <a:ext uri="{28A0092B-C50C-407E-A947-70E740481C1C}">
+                          <a14:useLocalDpi xmlns:a14="http://schemas.microsoft.com/office/drawing/2010/main" val="0"/>
+                        </a:ext>
+                      </a:extLst>
+                    </a:blip>
                     <a:srcRect/>
                     <a:stretch>
                       <a:fillRect/>
@@ -16650,11 +16678,15 @@
                   <pic:spPr bwMode="auto">
                     <a:xfrm>
                       <a:off x="0" y="0"/>
-                      <a:ext cx="5958366" cy="4404154"/>
+                      <a:ext cx="5943600" cy="4391025"/>
                     </a:xfrm>
                     <a:prstGeom prst="rect">
                       <a:avLst/>
                     </a:prstGeom>
+                    <a:noFill/>
+                    <a:ln>
+                      <a:noFill/>
+                    </a:ln>
                   </pic:spPr>
                 </pic:pic>
               </a:graphicData>
@@ -29611,17 +29643,13 @@
       </w:pPr>
       <w:r>
         <w:rPr>
-          <w:rFonts w:ascii="Times New Roman" w:hAnsi="Times New Roman"/>
           <w:noProof/>
-          <w:sz w:val="28"/>
-          <w:szCs w:val="28"/>
-          <w:lang w:val="ru-RU"/>
         </w:rPr>
         <w:drawing>
-          <wp:inline distT="0" distB="0" distL="0" distR="0" wp14:anchorId="7B8F6F07" wp14:editId="28F005CB">
-            <wp:extent cx="2857500" cy="4218214"/>
+          <wp:inline distT="0" distB="0" distL="0" distR="0" wp14:anchorId="22A5C87A" wp14:editId="4D08AF42">
+            <wp:extent cx="3209524" cy="4447619"/>
             <wp:effectExtent l="0" t="0" r="0" b="0"/>
-            <wp:docPr id="1220805851" name="Рисунок 2"/>
+            <wp:docPr id="1178132583" name="Рисунок 1"/>
             <wp:cNvGraphicFramePr>
               <a:graphicFrameLocks xmlns:a="http://schemas.openxmlformats.org/drawingml/2006/main" noChangeAspect="1"/>
             </wp:cNvGraphicFramePr>
@@ -29629,36 +29657,23 @@
               <a:graphicData uri="http://schemas.openxmlformats.org/drawingml/2006/picture">
                 <pic:pic xmlns:pic="http://schemas.openxmlformats.org/drawingml/2006/picture">
                   <pic:nvPicPr>
-                    <pic:cNvPr id="0" name="Picture 2"/>
-                    <pic:cNvPicPr>
-                      <a:picLocks noChangeAspect="1" noChangeArrowheads="1"/>
-                    </pic:cNvPicPr>
+                    <pic:cNvPr id="1178132583" name=""/>
+                    <pic:cNvPicPr/>
                   </pic:nvPicPr>
                   <pic:blipFill>
-                    <a:blip r:embed="rId21">
-                      <a:extLst>
-                        <a:ext uri="{28A0092B-C50C-407E-A947-70E740481C1C}">
-                          <a14:useLocalDpi xmlns:a14="http://schemas.microsoft.com/office/drawing/2010/main" val="0"/>
-                        </a:ext>
-                      </a:extLst>
-                    </a:blip>
-                    <a:srcRect/>
+                    <a:blip r:embed="rId21"/>
                     <a:stretch>
                       <a:fillRect/>
                     </a:stretch>
                   </pic:blipFill>
-                  <pic:spPr bwMode="auto">
+                  <pic:spPr>
                     <a:xfrm>
                       <a:off x="0" y="0"/>
-                      <a:ext cx="2859734" cy="4221511"/>
+                      <a:ext cx="3209524" cy="4447619"/>
                     </a:xfrm>
                     <a:prstGeom prst="rect">
                       <a:avLst/>
                     </a:prstGeom>
-                    <a:noFill/>
-                    <a:ln>
-                      <a:noFill/>
-                    </a:ln>
                   </pic:spPr>
                 </pic:pic>
               </a:graphicData>
@@ -59268,6 +59283,7 @@
   <w:style w:type="character" w:default="1" w:styleId="a1">
     <w:name w:val="Default Paragraph Font"/>
     <w:uiPriority w:val="1"/>
+    <w:semiHidden/>
     <w:unhideWhenUsed/>
   </w:style>
   <w:style w:type="table" w:default="1" w:styleId="a2">

</xml_diff>